<commit_message>
Fill transfer-school dates in ASU resume
Co-Authored-By: Claude Sonnet 5.5 <noreply@anthropic.com>
Claude-Session: https://claude.ai/code/session_01TxiZBwuSbNT5xu8DH8oTXg
</commit_message>
<xml_diff>
--- a/ASU_MSBA/resume/Resume_ASU_Sukwoo_Chung.docx
+++ b/ASU_MSBA/resume/Resume_ASU_Sukwoo_Chung.docx
@@ -137,7 +137,7 @@
           <w:szCs w:val="20"/>
         </w:rPr>
         <w:tab/>
-        <w:t>[MM/YY – MM/YY]</w:t>
+        <w:t>07/08 – 08/08</w:t>
       </w:r>
     </w:p>
     <w:p>
@@ -161,7 +161,7 @@
           <w:szCs w:val="20"/>
         </w:rPr>
         <w:tab/>
-        <w:t>[MM/YY – MM/YY]</w:t>
+        <w:t>05/12 – 06/12</w:t>
       </w:r>
     </w:p>
     <w:p>

</xml_diff>